<commit_message>
Fix dashboard root detection and improve stable live emotion inference
</commit_message>
<xml_diff>
--- a/lance_0a0_last_version.docx
+++ b/lance_0a0_last_version.docx
@@ -3,13 +3,8 @@
 <w:document xmlns:wpc="http://schemas.microsoft.com/office/word/2010/wordprocessingCanvas" xmlns:cx="http://schemas.microsoft.com/office/drawing/2014/chartex" xmlns:cx1="http://schemas.microsoft.com/office/drawing/2015/9/8/chartex" xmlns:cx2="http://schemas.microsoft.com/office/drawing/2015/10/21/chartex" xmlns:cx3="http://schemas.microsoft.com/office/drawing/2016/5/9/chartex" xmlns:cx4="http://schemas.microsoft.com/office/drawing/2016/5/10/chartex" xmlns:cx5="http://schemas.microsoft.com/office/drawing/2016/5/11/chartex" xmlns:cx6="http://schemas.microsoft.com/office/drawing/2016/5/12/chartex" xmlns:cx7="http://schemas.microsoft.com/office/drawing/2016/5/13/chartex" xmlns:cx8="http://schemas.microsoft.com/office/drawing/2016/5/14/chartex" xmlns:mc="http://schemas.openxmlformats.org/markup-compatibility/2006" xmlns:aink="http://schemas.microsoft.com/office/drawing/2016/ink" xmlns:am3d="http://schemas.microsoft.com/office/drawing/2017/model3d" xmlns:o="urn:schemas-microsoft-com:office:office" xmlns:oel="http://schemas.microsoft.com/office/2019/extlst" xmlns:r="http://schemas.openxmlformats.org/officeDocument/2006/relationships" xmlns:m="http://schemas.openxmlformats.org/officeDocument/2006/math" xmlns:v="urn:schemas-microsoft-com:vml" xmlns:wp14="http://schemas.microsoft.com/office/word/2010/wordprocessingDrawing" xmlns:wp="http://schemas.openxmlformats.org/drawingml/2006/wordprocessingDrawing" xmlns:w10="urn:schemas-microsoft-com:office:word" xmlns:w="http://schemas.openxmlformats.org/wordprocessingml/2006/main" xmlns:w14="http://schemas.microsoft.com/office/word/2010/wordml" xmlns:w15="http://schemas.microsoft.com/office/word/2012/wordml" xmlns:w16cex="http://schemas.microsoft.com/office/word/2018/wordml/cex" xmlns:w16cid="http://schemas.microsoft.com/office/word/2016/wordml/cid" xmlns:w16="http://schemas.microsoft.com/office/word/2018/wordml" xmlns:w16du="http://schemas.microsoft.com/office/word/2023/wordml/word16du" xmlns:w16sdtdh="http://schemas.microsoft.com/office/word/2020/wordml/sdtdatahash" xmlns:w16sdtfl="http://schemas.microsoft.com/office/word/2024/wordml/sdtformatlock" xmlns:w16se="http://schemas.microsoft.com/office/word/2015/wordml/symex" xmlns:wpg="http://schemas.microsoft.com/office/word/2010/wordprocessingGroup" xmlns:wpi="http://schemas.microsoft.com/office/word/2010/wordprocessingInk" xmlns:wne="http://schemas.microsoft.com/office/word/2006/wordml" xmlns:wps="http://schemas.microsoft.com/office/word/2010/wordprocessingShape" mc:Ignorable="w14 w15 w16se w16cid w16 w16cex w16sdtdh w16sdtfl w16du wp14">
   <w:body>
     <w:p>
-      <w:proofErr w:type="gramStart"/>
-      <w:r>
-        <w:t>une</w:t>
-      </w:r>
-      <w:proofErr w:type="gramEnd"/>
-      <w:r>
-        <w:t xml:space="preserve"> </w:t>
+      <w:r>
+        <w:t xml:space="preserve">une </w:t>
       </w:r>
       <w:r>
         <w:rPr>
@@ -370,16 +365,41 @@
           <w:bCs/>
           <w:highlight w:val="red"/>
         </w:rPr>
-        <w:t xml:space="preserve"> </w:t>
-      </w:r>
-      <w:proofErr w:type="gramStart"/>
+        <w:t xml:space="preserve"> s’appelle .</w:t>
+      </w:r>
+      <w:proofErr w:type="spellStart"/>
       <w:r>
         <w:rPr>
           <w:b/>
           <w:bCs/>
           <w:highlight w:val="red"/>
         </w:rPr>
-        <w:t>s’appelle .</w:t>
+        <w:t>venv</w:t>
+      </w:r>
+      <w:proofErr w:type="spellEnd"/>
+      <w:r>
+        <w:rPr>
+          <w:b/>
+          <w:bCs/>
+          <w:highlight w:val="red"/>
+        </w:rPr>
+        <w:t xml:space="preserve"> (comme avant) :</w:t>
+      </w:r>
+    </w:p>
+    <w:p>
+      <w:pPr>
+        <w:rPr>
+          <w:b/>
+          <w:bCs/>
+        </w:rPr>
+      </w:pPr>
+      <w:r>
+        <w:rPr>
+          <w:b/>
+          <w:bCs/>
+          <w:highlight w:val="red"/>
+        </w:rPr>
+        <w:t>.\.</w:t>
       </w:r>
       <w:proofErr w:type="spellStart"/>
       <w:r>
@@ -391,75 +411,102 @@
         <w:t>venv</w:t>
       </w:r>
       <w:proofErr w:type="spellEnd"/>
-      <w:proofErr w:type="gramEnd"/>
       <w:r>
         <w:rPr>
           <w:b/>
           <w:bCs/>
           <w:highlight w:val="red"/>
         </w:rPr>
-        <w:t xml:space="preserve"> (comme avant) :</w:t>
-      </w:r>
-    </w:p>
-    <w:p>
-      <w:pPr>
-        <w:rPr>
-          <w:b/>
-          <w:bCs/>
-        </w:rPr>
-      </w:pPr>
-      <w:proofErr w:type="gramStart"/>
+        <w:t>\Scripts\</w:t>
+      </w:r>
+      <w:proofErr w:type="spellStart"/>
       <w:r>
         <w:rPr>
           <w:b/>
           <w:bCs/>
           <w:highlight w:val="red"/>
         </w:rPr>
-        <w:t>.\.</w:t>
+        <w:t>activate</w:t>
+      </w:r>
+      <w:proofErr w:type="spellEnd"/>
+    </w:p>
+    <w:p>
+      <w:pPr>
+        <w:rPr>
+          <w:b/>
+          <w:bCs/>
+        </w:rPr>
+      </w:pPr>
+    </w:p>
+    <w:p>
+      <w:pPr>
+        <w:rPr>
+          <w:b/>
+          <w:bCs/>
+          <w:lang w:val="en-US"/>
+        </w:rPr>
+      </w:pPr>
+      <w:r>
+        <w:rPr>
+          <w:b/>
+          <w:bCs/>
+          <w:lang w:val="en-US"/>
+        </w:rPr>
+        <w:t xml:space="preserve">pip install -U </w:t>
       </w:r>
       <w:proofErr w:type="spellStart"/>
       <w:r>
         <w:rPr>
           <w:b/>
           <w:bCs/>
-          <w:highlight w:val="red"/>
-        </w:rPr>
-        <w:t>venv</w:t>
+          <w:lang w:val="en-US"/>
+        </w:rPr>
+        <w:t>onnxruntime-gpu</w:t>
       </w:r>
       <w:proofErr w:type="spellEnd"/>
       <w:r>
         <w:rPr>
           <w:b/>
           <w:bCs/>
-          <w:highlight w:val="red"/>
-        </w:rPr>
-        <w:t>\Scripts\</w:t>
+          <w:lang w:val="en-US"/>
+        </w:rPr>
+        <w:t xml:space="preserve"> transformers optimum[</w:t>
       </w:r>
       <w:proofErr w:type="spellStart"/>
       <w:r>
         <w:rPr>
           <w:b/>
           <w:bCs/>
-          <w:highlight w:val="red"/>
-        </w:rPr>
-        <w:t>activate</w:t>
+          <w:lang w:val="en-US"/>
+        </w:rPr>
+        <w:t>onnxruntime</w:t>
       </w:r>
       <w:proofErr w:type="spellEnd"/>
-      <w:proofErr w:type="gramEnd"/>
-    </w:p>
-    <w:p>
-      <w:pPr>
-        <w:rPr>
-          <w:b/>
-          <w:bCs/>
-        </w:rPr>
-      </w:pPr>
-    </w:p>
-    <w:p>
-      <w:pPr>
-        <w:rPr>
-          <w:b/>
-          <w:bCs/>
+      <w:r>
+        <w:rPr>
+          <w:b/>
+          <w:bCs/>
+          <w:lang w:val="en-US"/>
+        </w:rPr>
+        <w:t xml:space="preserve">] torch </w:t>
+      </w:r>
+      <w:proofErr w:type="spellStart"/>
+      <w:r>
+        <w:rPr>
+          <w:b/>
+          <w:bCs/>
+          <w:lang w:val="en-US"/>
+        </w:rPr>
+        <w:t>torchvision</w:t>
+      </w:r>
+      <w:proofErr w:type="spellEnd"/>
+    </w:p>
+    <w:p>
+      <w:pPr>
+        <w:rPr>
+          <w:b/>
+          <w:bCs/>
+          <w:lang w:val="en-US"/>
         </w:rPr>
       </w:pPr>
     </w:p>
@@ -660,6 +707,7 @@
           <w:b/>
           <w:bCs/>
         </w:rPr>
+        <w:lastRenderedPageBreak/>
         <w:t xml:space="preserve">3) Arrêter </w:t>
       </w:r>
       <w:proofErr w:type="spellStart"/>
@@ -697,7 +745,6 @@
     </w:p>
     <w:p>
       <w:r>
-        <w:lastRenderedPageBreak/>
         <w:t xml:space="preserve">Dans le terminal où </w:t>
       </w:r>
       <w:proofErr w:type="spellStart"/>
@@ -740,13 +787,8 @@
       </w:r>
     </w:p>
     <w:p>
-      <w:proofErr w:type="gramStart"/>
-      <w:r>
-        <w:t>docker</w:t>
-      </w:r>
-      <w:proofErr w:type="gramEnd"/>
-      <w:r>
-        <w:t xml:space="preserve"> compose down</w:t>
+      <w:r>
+        <w:t>docker compose down</w:t>
       </w:r>
     </w:p>
     <w:p>
@@ -761,13 +803,8 @@
       </w:r>
     </w:p>
     <w:p>
-      <w:proofErr w:type="gramStart"/>
-      <w:r>
-        <w:t>docker</w:t>
-      </w:r>
-      <w:proofErr w:type="gramEnd"/>
-      <w:r>
-        <w:t xml:space="preserve"> </w:t>
+      <w:r>
+        <w:t xml:space="preserve">docker </w:t>
       </w:r>
       <w:proofErr w:type="spellStart"/>
       <w:r>
@@ -802,11 +839,7 @@
       </w:r>
       <w:r>
         <w:br/>
-        <w:t>(</w:t>
-      </w:r>
-      <w:proofErr w:type="gramStart"/>
-      <w:r>
-        <w:t xml:space="preserve">je te conseille </w:t>
+        <w:t xml:space="preserve">(je te conseille </w:t>
       </w:r>
       <w:r>
         <w:rPr>
@@ -815,7 +848,6 @@
         </w:rPr>
         <w:t>pas</w:t>
       </w:r>
-      <w:proofErr w:type="gramEnd"/>
       <w:r>
         <w:t xml:space="preserve"> sauf si tu veux reset total)</w:t>
       </w:r>
@@ -863,13 +895,8 @@
       </w:r>
     </w:p>
     <w:p>
-      <w:proofErr w:type="gramStart"/>
-      <w:r>
-        <w:t>docker</w:t>
-      </w:r>
-      <w:proofErr w:type="gramEnd"/>
-      <w:r>
-        <w:t xml:space="preserve"> compose up -d</w:t>
+      <w:r>
+        <w:t>docker compose up -d</w:t>
       </w:r>
     </w:p>
     <w:p>
@@ -908,13 +935,8 @@
           <w:numId w:val="3"/>
         </w:numPr>
       </w:pPr>
-      <w:proofErr w:type="gramStart"/>
-      <w:r>
-        <w:t>final</w:t>
-      </w:r>
-      <w:proofErr w:type="gramEnd"/>
-      <w:r>
-        <w:t>_project-zookeeper-1</w:t>
+      <w:r>
+        <w:t>final_project-zookeeper-1</w:t>
       </w:r>
     </w:p>
     <w:p>
@@ -924,13 +946,8 @@
           <w:numId w:val="3"/>
         </w:numPr>
       </w:pPr>
-      <w:proofErr w:type="gramStart"/>
-      <w:r>
-        <w:t>final</w:t>
-      </w:r>
-      <w:proofErr w:type="gramEnd"/>
-      <w:r>
-        <w:t>_project-kafka-1</w:t>
+      <w:r>
+        <w:t>final_project-kafka-1</w:t>
       </w:r>
     </w:p>
     <w:p>
@@ -940,13 +957,8 @@
           <w:numId w:val="3"/>
         </w:numPr>
       </w:pPr>
-      <w:proofErr w:type="gramStart"/>
-      <w:r>
-        <w:t>final</w:t>
-      </w:r>
-      <w:proofErr w:type="gramEnd"/>
-      <w:r>
-        <w:t>_project-spark-master-1</w:t>
+      <w:r>
+        <w:t>final_project-spark-master-1</w:t>
       </w:r>
     </w:p>
     <w:p>
@@ -956,13 +968,8 @@
           <w:numId w:val="3"/>
         </w:numPr>
       </w:pPr>
-      <w:proofErr w:type="gramStart"/>
-      <w:r>
-        <w:t>final</w:t>
-      </w:r>
-      <w:proofErr w:type="gramEnd"/>
-      <w:r>
-        <w:t>_project-spark-worker-1</w:t>
+      <w:r>
+        <w:t>final_project-spark-worker-1</w:t>
       </w:r>
     </w:p>
     <w:p>
@@ -1085,23 +1092,23 @@
           <w:i/>
           <w:iCs/>
         </w:rPr>
-        <w:t>(</w:t>
-      </w:r>
-      <w:proofErr w:type="gramStart"/>
+        <w:t xml:space="preserve">(tu peux garder </w:t>
+      </w:r>
+      <w:proofErr w:type="spellStart"/>
       <w:r>
         <w:rPr>
           <w:i/>
           <w:iCs/>
         </w:rPr>
-        <w:t>tu</w:t>
-      </w:r>
-      <w:proofErr w:type="gramEnd"/>
+        <w:t>test_topic</w:t>
+      </w:r>
+      <w:proofErr w:type="spellEnd"/>
       <w:r>
         <w:rPr>
           <w:i/>
           <w:iCs/>
         </w:rPr>
-        <w:t xml:space="preserve"> peux garder </w:t>
+        <w:t xml:space="preserve"> ou mettre </w:t>
       </w:r>
       <w:proofErr w:type="spellStart"/>
       <w:r>
@@ -1109,7 +1116,7 @@
           <w:i/>
           <w:iCs/>
         </w:rPr>
-        <w:t>test_topic</w:t>
+        <w:t>emotion_events</w:t>
       </w:r>
       <w:proofErr w:type="spellEnd"/>
       <w:r>
@@ -1117,22 +1124,6 @@
           <w:i/>
           <w:iCs/>
         </w:rPr>
-        <w:t xml:space="preserve"> ou mettre </w:t>
-      </w:r>
-      <w:proofErr w:type="spellStart"/>
-      <w:r>
-        <w:rPr>
-          <w:i/>
-          <w:iCs/>
-        </w:rPr>
-        <w:t>emotion_events</w:t>
-      </w:r>
-      <w:proofErr w:type="spellEnd"/>
-      <w:r>
-        <w:rPr>
-          <w:i/>
-          <w:iCs/>
-        </w:rPr>
         <w:t>)</w:t>
       </w:r>
     </w:p>
@@ -1189,25 +1180,12 @@
         <w:t xml:space="preserve"> Tu dois voir </w:t>
       </w:r>
       <w:proofErr w:type="spellStart"/>
-      <w:proofErr w:type="gramStart"/>
       <w:r>
         <w:t>PartitionCount</w:t>
       </w:r>
       <w:proofErr w:type="spellEnd"/>
       <w:r>
-        <w:t>:</w:t>
-      </w:r>
-      <w:proofErr w:type="gramEnd"/>
-      <w:r>
-        <w:t xml:space="preserve"> 1 et </w:t>
-      </w:r>
-      <w:proofErr w:type="gramStart"/>
-      <w:r>
-        <w:t>Leader:</w:t>
-      </w:r>
-      <w:proofErr w:type="gramEnd"/>
-      <w:r>
-        <w:t xml:space="preserve"> 1.</w:t>
+        <w:t>: 1 et Leader: 1.</w:t>
       </w:r>
     </w:p>
     <w:p>
@@ -1306,15 +1284,7 @@
       </w:r>
       <w:proofErr w:type="spellStart"/>
       <w:r>
-        <w:t>hello</w:t>
-      </w:r>
-      <w:proofErr w:type="gramStart"/>
-      <w:r>
-        <w:t>":</w:t>
-      </w:r>
-      <w:proofErr w:type="gramEnd"/>
-      <w:r>
-        <w:t>"world</w:t>
+        <w:t>hello":"world</w:t>
       </w:r>
       <w:proofErr w:type="spellEnd"/>
       <w:r>
@@ -1355,23 +1325,7 @@
           <w:b/>
           <w:bCs/>
         </w:rPr>
-        <w:t>1) Nettoyer le checkpoint (</w:t>
-      </w:r>
-      <w:proofErr w:type="gramStart"/>
-      <w:r>
-        <w:rPr>
-          <w:b/>
-          <w:bCs/>
-        </w:rPr>
-        <w:t>option recommandé</w:t>
-      </w:r>
-      <w:proofErr w:type="gramEnd"/>
-      <w:r>
-        <w:rPr>
-          <w:b/>
-          <w:bCs/>
-        </w:rPr>
-        <w:t xml:space="preserve"> si bug)</w:t>
+        <w:t>1) Nettoyer le checkpoint (option recommandé si bug)</w:t>
       </w:r>
     </w:p>
     <w:p>
@@ -1584,15 +1538,7 @@
         </w:numPr>
       </w:pPr>
       <w:r>
-        <w:t xml:space="preserve">Vérifie </w:t>
-      </w:r>
-      <w:proofErr w:type="gramStart"/>
-      <w:r>
-        <w:t>qu’un .parquet</w:t>
-      </w:r>
-      <w:proofErr w:type="gramEnd"/>
-      <w:r>
-        <w:t xml:space="preserve"> apparaît :</w:t>
+        <w:t>Vérifie qu’un .parquet apparaît :</w:t>
       </w:r>
     </w:p>
     <w:p>
@@ -1616,15 +1562,7 @@
         <w:t>✅</w:t>
       </w:r>
       <w:r>
-        <w:t xml:space="preserve"> Si tu vois part</w:t>
-      </w:r>
-      <w:proofErr w:type="gramStart"/>
-      <w:r>
-        <w:t>-....</w:t>
-      </w:r>
-      <w:proofErr w:type="gramEnd"/>
-      <w:r>
-        <w:t>parquet, c’est bon.</w:t>
+        <w:t xml:space="preserve"> Si tu vois part-....parquet, c’est bon.</w:t>
       </w:r>
     </w:p>
     <w:p>
@@ -1657,16 +1595,34 @@
       </w:r>
     </w:p>
     <w:p>
+      <w:pPr>
+        <w:rPr>
+          <w:lang w:val="en-US"/>
+        </w:rPr>
+      </w:pPr>
       <w:proofErr w:type="spellStart"/>
-      <w:proofErr w:type="gramStart"/>
-      <w:r>
+      <w:r>
+        <w:rPr>
+          <w:highlight w:val="yellow"/>
+          <w:lang w:val="en-US"/>
+        </w:rPr>
         <w:t>streamlit</w:t>
       </w:r>
       <w:proofErr w:type="spellEnd"/>
-      <w:proofErr w:type="gramEnd"/>
-      <w:r>
-        <w:t xml:space="preserve"> run app.py</w:t>
-      </w:r>
+      <w:r>
+        <w:rPr>
+          <w:highlight w:val="yellow"/>
+          <w:lang w:val="en-US"/>
+        </w:rPr>
+        <w:t xml:space="preserve"> run src\dashboard\app.py</w:t>
+      </w:r>
+    </w:p>
+    <w:p>
+      <w:pPr>
+        <w:rPr>
+          <w:lang w:val="en-US"/>
+        </w:rPr>
+      </w:pPr>
     </w:p>
     <w:p>
       <w:r>
@@ -1674,23 +1630,7 @@
           <w:i/>
           <w:iCs/>
         </w:rPr>
-        <w:t>(</w:t>
-      </w:r>
-      <w:proofErr w:type="gramStart"/>
-      <w:r>
-        <w:rPr>
-          <w:i/>
-          <w:iCs/>
-        </w:rPr>
-        <w:t>ou</w:t>
-      </w:r>
-      <w:proofErr w:type="gramEnd"/>
-      <w:r>
-        <w:rPr>
-          <w:i/>
-          <w:iCs/>
-        </w:rPr>
-        <w:t xml:space="preserve"> si c’est dans un dossier précis : adapte le chemin)</w:t>
+        <w:t>(ou si c’est dans un dossier précis : adapte le chemin)</w:t>
       </w:r>
     </w:p>
     <w:p>
@@ -1930,21 +1870,7 @@
         <w:rPr>
           <w:lang w:val="en-US"/>
         </w:rPr>
-        <w:t xml:space="preserve"> 2 -type f -name '</w:t>
-      </w:r>
-      <w:proofErr w:type="gramStart"/>
-      <w:r>
-        <w:rPr>
-          <w:lang w:val="en-US"/>
-        </w:rPr>
-        <w:t>*.parquet</w:t>
-      </w:r>
-      <w:proofErr w:type="gramEnd"/>
-      <w:r>
-        <w:rPr>
-          <w:lang w:val="en-US"/>
-        </w:rPr>
-        <w:t>' | tail -n 5"</w:t>
+        <w:t xml:space="preserve"> 2 -type f -name '*.parquet' | tail -n 5"</w:t>
       </w:r>
     </w:p>
     <w:p>
@@ -1969,13 +1895,9 @@
           <w:numId w:val="7"/>
         </w:numPr>
       </w:pPr>
-      <w:proofErr w:type="gramStart"/>
-      <w:r>
-        <w:t>le</w:t>
-      </w:r>
-      <w:proofErr w:type="gramEnd"/>
-      <w:r>
-        <w:t xml:space="preserve"> compteur Events doit monter</w:t>
+      <w:r>
+        <w:lastRenderedPageBreak/>
+        <w:t>le compteur Events doit monter</w:t>
       </w:r>
     </w:p>
     <w:p>
@@ -1985,14 +1907,8 @@
           <w:numId w:val="7"/>
         </w:numPr>
       </w:pPr>
-      <w:proofErr w:type="gramStart"/>
-      <w:r>
-        <w:lastRenderedPageBreak/>
-        <w:t>tes</w:t>
-      </w:r>
-      <w:proofErr w:type="gramEnd"/>
-      <w:r>
-        <w:t xml:space="preserve"> graphs doivent se remplir</w:t>
+      <w:r>
+        <w:t>tes graphs doivent se remplir</w:t>
       </w:r>
     </w:p>
     <w:p>
@@ -2094,13 +2010,8 @@
       </w:r>
     </w:p>
     <w:p>
-      <w:proofErr w:type="gramStart"/>
-      <w:r>
-        <w:t>docker</w:t>
-      </w:r>
-      <w:proofErr w:type="gramEnd"/>
-      <w:r>
-        <w:t xml:space="preserve"> compose down</w:t>
+      <w:r>
+        <w:t>docker compose down</w:t>
       </w:r>
     </w:p>
     <w:p>
@@ -4064,6 +3975,7 @@
   <w:style w:type="character" w:default="1" w:styleId="Policepardfaut">
     <w:name w:val="Default Paragraph Font"/>
     <w:uiPriority w:val="1"/>
+    <w:semiHidden/>
     <w:unhideWhenUsed/>
   </w:style>
   <w:style w:type="table" w:default="1" w:styleId="TableauNormal">

</xml_diff>